<commit_message>
Add Kazakh lesson plan and worksheet for 8.2.1.2
Also fix the task 8 caption in the Russian worksheet (it mentioned a
rule line that the table does not draw).

Co-Authored-By: Claude Opus 5.5 <noreply@anthropic.com>
Claude-Session: https://claude.ai/code/session_0164xp6oPnH8L5Boehw5Rv1U
</commit_message>
<xml_diff>
--- a/8.2.1.2-arithmetic/razdatka-8.2.1.2.docx
+++ b/8.2.1.2-arithmetic/razdatka-8.2.1.2.docx
@@ -6511,7 +6511,7 @@
           <w:sz w:val="20"/>
           <w:szCs w:val="20"/>
         </w:rPr>
-        <w:t xml:space="preserve">                  (все числа восьмеричные; черта под вторым числом — как в столбике)</w:t>
+        <w:t xml:space="preserve">(все числа записаны в восьмеричной системе счисления)</w:t>
       </w:r>
     </w:p>
     <w:p>
@@ -14258,7 +14258,7 @@
           <w:sz w:val="20"/>
           <w:szCs w:val="20"/>
         </w:rPr>
-        <w:t xml:space="preserve">                  (все числа восьмеричные; черта под вторым числом — как в столбике)</w:t>
+        <w:t xml:space="preserve">(все числа записаны в восьмеричной системе счисления)</w:t>
       </w:r>
     </w:p>
     <w:p>

</xml_diff>